<commit_message>
Final commit before cleaning everything up
</commit_message>
<xml_diff>
--- a/stat_results/Results Statistical Analysis.docx
+++ b/stat_results/Results Statistical Analysis.docx
@@ -364,15 +364,14 @@
       </w:pPr>
       <w:r>
         <w:rPr>
-          <w:noProof/>
           <w:lang w:val="en-US"/>
         </w:rPr>
         <w:lastRenderedPageBreak/>
         <w:drawing>
-          <wp:inline distT="0" distB="0" distL="0" distR="0" wp14:anchorId="141265D5" wp14:editId="6B2C1D3C">
-            <wp:extent cx="5017502" cy="4064000"/>
-            <wp:effectExtent l="0" t="0" r="0" b="0"/>
-            <wp:docPr id="25" name="Afbeelding 25"/>
+          <wp:inline distT="0" distB="0" distL="0" distR="0" wp14:anchorId="3D49F21A" wp14:editId="3AD8FCF0">
+            <wp:extent cx="5760720" cy="4684395"/>
+            <wp:effectExtent l="0" t="0" r="0" b="1905"/>
+            <wp:docPr id="13" name="Afbeelding 13"/>
             <wp:cNvGraphicFramePr>
               <a:graphicFrameLocks xmlns:a="http://schemas.openxmlformats.org/drawingml/2006/main" noChangeAspect="1"/>
             </wp:cNvGraphicFramePr>
@@ -392,7 +391,7 @@
                   <pic:spPr>
                     <a:xfrm>
                       <a:off x="0" y="0"/>
-                      <a:ext cx="5018537" cy="4064838"/>
+                      <a:ext cx="5760720" cy="4684395"/>
                     </a:xfrm>
                     <a:prstGeom prst="rect">
                       <a:avLst/>
@@ -411,6 +410,13 @@
           <w:lang w:val="en-US"/>
         </w:rPr>
       </w:pPr>
+    </w:p>
+    <w:p>
+      <w:pPr>
+        <w:rPr>
+          <w:lang w:val="en-US"/>
+        </w:rPr>
+      </w:pPr>
       <w:r>
         <w:rPr>
           <w:lang w:val="en-US"/>
@@ -426,15 +432,14 @@
       </w:pPr>
       <w:r>
         <w:rPr>
-          <w:noProof/>
           <w:lang w:val="en-US"/>
         </w:rPr>
         <w:lastRenderedPageBreak/>
         <w:drawing>
-          <wp:inline distT="0" distB="0" distL="0" distR="0" wp14:anchorId="3AC69EAA" wp14:editId="06DDCA0A">
-            <wp:extent cx="2971800" cy="2747185"/>
-            <wp:effectExtent l="0" t="0" r="0" b="0"/>
-            <wp:docPr id="3" name="Afbeelding 3"/>
+          <wp:inline distT="0" distB="0" distL="0" distR="0" wp14:anchorId="25216E77" wp14:editId="4A498A77">
+            <wp:extent cx="3600450" cy="3731375"/>
+            <wp:effectExtent l="0" t="0" r="0" b="2540"/>
+            <wp:docPr id="14" name="Afbeelding 14"/>
             <wp:cNvGraphicFramePr>
               <a:graphicFrameLocks xmlns:a="http://schemas.openxmlformats.org/drawingml/2006/main" noChangeAspect="1"/>
             </wp:cNvGraphicFramePr>
@@ -454,7 +459,7 @@
                   <pic:spPr>
                     <a:xfrm>
                       <a:off x="0" y="0"/>
-                      <a:ext cx="2975309" cy="2750429"/>
+                      <a:ext cx="3605016" cy="3736107"/>
                     </a:xfrm>
                     <a:prstGeom prst="rect">
                       <a:avLst/>
@@ -1779,6 +1784,7 @@
       </w:pPr>
       <w:r>
         <w:rPr>
+          <w:noProof/>
           <w:sz w:val="28"/>
           <w:szCs w:val="28"/>
           <w:lang w:val="en-US"/>
@@ -2313,6 +2319,7 @@
       </w:pPr>
       <w:r>
         <w:rPr>
+          <w:noProof/>
           <w:sz w:val="28"/>
           <w:szCs w:val="28"/>
           <w:lang w:val="en-US"/>
@@ -2373,6 +2380,7 @@
       </w:pPr>
       <w:r>
         <w:rPr>
+          <w:noProof/>
           <w:sz w:val="28"/>
           <w:szCs w:val="28"/>
           <w:lang w:val="en-US"/>
@@ -3291,6 +3299,7 @@
       </w:pPr>
       <w:r>
         <w:rPr>
+          <w:noProof/>
           <w:sz w:val="28"/>
           <w:szCs w:val="28"/>
           <w:lang w:val="en-US"/>
@@ -3348,16 +3357,16 @@
           <w:rFonts w:ascii="Times New Roman" w:eastAsia="Times New Roman" w:hAnsi="Times New Roman" w:cs="Times New Roman"/>
           <w:sz w:val="24"/>
           <w:szCs w:val="24"/>
+          <w:lang w:val="en-US" w:eastAsia="nl-NL"/>
+        </w:rPr>
+      </w:pPr>
+      <w:r>
+        <w:rPr>
+          <w:rFonts w:ascii="Times New Roman" w:eastAsia="Times New Roman" w:hAnsi="Symbol" w:cs="Times New Roman"/>
+          <w:sz w:val="24"/>
+          <w:szCs w:val="24"/>
           <w:lang w:eastAsia="nl-NL"/>
         </w:rPr>
-      </w:pPr>
-      <w:r>
-        <w:rPr>
-          <w:rFonts w:ascii="Times New Roman" w:eastAsia="Times New Roman" w:hAnsi="Symbol" w:cs="Times New Roman"/>
-          <w:sz w:val="24"/>
-          <w:szCs w:val="24"/>
-          <w:lang w:eastAsia="nl-NL"/>
-        </w:rPr>
         <w:t></w:t>
       </w:r>
       <w:r>
@@ -3365,69 +3374,9 @@
           <w:rFonts w:ascii="Times New Roman" w:eastAsia="Times New Roman" w:hAnsi="Times New Roman" w:cs="Times New Roman"/>
           <w:sz w:val="24"/>
           <w:szCs w:val="24"/>
-          <w:lang w:eastAsia="nl-NL"/>
-        </w:rPr>
-        <w:t xml:space="preserve">  NCC </w:t>
-      </w:r>
-      <w:proofErr w:type="spellStart"/>
-      <w:r>
-        <w:rPr>
-          <w:rFonts w:ascii="Times New Roman" w:eastAsia="Times New Roman" w:hAnsi="Times New Roman" w:cs="Times New Roman"/>
-          <w:sz w:val="24"/>
-          <w:szCs w:val="24"/>
-          <w:lang w:eastAsia="nl-NL"/>
-        </w:rPr>
-        <w:t>central</w:t>
-      </w:r>
-      <w:proofErr w:type="spellEnd"/>
-      <w:r>
-        <w:rPr>
-          <w:rFonts w:ascii="Times New Roman" w:eastAsia="Times New Roman" w:hAnsi="Times New Roman" w:cs="Times New Roman"/>
-          <w:sz w:val="24"/>
-          <w:szCs w:val="24"/>
-          <w:lang w:eastAsia="nl-NL"/>
-        </w:rPr>
-        <w:t xml:space="preserve"> </w:t>
-      </w:r>
-      <w:proofErr w:type="spellStart"/>
-      <w:r>
-        <w:rPr>
-          <w:rFonts w:ascii="Times New Roman" w:eastAsia="Times New Roman" w:hAnsi="Times New Roman" w:cs="Times New Roman"/>
-          <w:sz w:val="24"/>
-          <w:szCs w:val="24"/>
-          <w:lang w:eastAsia="nl-NL"/>
-        </w:rPr>
-        <w:t>vs</w:t>
-      </w:r>
-      <w:proofErr w:type="spellEnd"/>
-      <w:r>
-        <w:rPr>
-          <w:rFonts w:ascii="Times New Roman" w:eastAsia="Times New Roman" w:hAnsi="Times New Roman" w:cs="Times New Roman"/>
-          <w:sz w:val="24"/>
-          <w:szCs w:val="24"/>
-          <w:lang w:eastAsia="nl-NL"/>
-        </w:rPr>
-        <w:t xml:space="preserve"> </w:t>
-      </w:r>
-      <w:proofErr w:type="spellStart"/>
-      <w:r>
-        <w:rPr>
-          <w:rFonts w:ascii="Times New Roman" w:eastAsia="Times New Roman" w:hAnsi="Times New Roman" w:cs="Times New Roman"/>
-          <w:sz w:val="24"/>
-          <w:szCs w:val="24"/>
-          <w:lang w:eastAsia="nl-NL"/>
-        </w:rPr>
-        <w:t>peripheral</w:t>
-      </w:r>
-      <w:proofErr w:type="spellEnd"/>
-      <w:r>
-        <w:rPr>
-          <w:rFonts w:ascii="Times New Roman" w:eastAsia="Times New Roman" w:hAnsi="Times New Roman" w:cs="Times New Roman"/>
-          <w:sz w:val="24"/>
-          <w:szCs w:val="24"/>
-          <w:lang w:eastAsia="nl-NL"/>
-        </w:rPr>
-        <w:t xml:space="preserve">: </w:t>
+          <w:lang w:val="en-US" w:eastAsia="nl-NL"/>
+        </w:rPr>
+        <w:t xml:space="preserve">  NCC central vs peripheral: </w:t>
       </w:r>
       <w:r>
         <w:rPr>
@@ -3436,37 +3385,37 @@
           <w:bCs/>
           <w:sz w:val="24"/>
           <w:szCs w:val="24"/>
+          <w:lang w:val="en-US" w:eastAsia="nl-NL"/>
+        </w:rPr>
+        <w:t>0.59</w:t>
+      </w:r>
+      <w:r>
+        <w:rPr>
+          <w:rFonts w:ascii="Times New Roman" w:eastAsia="Times New Roman" w:hAnsi="Times New Roman" w:cs="Times New Roman"/>
+          <w:sz w:val="24"/>
+          <w:szCs w:val="24"/>
+          <w:lang w:val="en-US" w:eastAsia="nl-NL"/>
+        </w:rPr>
+        <w:t xml:space="preserve"> </w:t>
+      </w:r>
+    </w:p>
+    <w:p>
+      <w:pPr>
+        <w:spacing w:after="0" w:line="240" w:lineRule="auto"/>
+        <w:rPr>
+          <w:rFonts w:ascii="Times New Roman" w:eastAsia="Times New Roman" w:hAnsi="Times New Roman" w:cs="Times New Roman"/>
+          <w:sz w:val="24"/>
+          <w:szCs w:val="24"/>
+          <w:lang w:val="en-US" w:eastAsia="nl-NL"/>
+        </w:rPr>
+      </w:pPr>
+      <w:r>
+        <w:rPr>
+          <w:rFonts w:ascii="Times New Roman" w:eastAsia="Times New Roman" w:hAnsi="Symbol" w:cs="Times New Roman"/>
+          <w:sz w:val="24"/>
+          <w:szCs w:val="24"/>
           <w:lang w:eastAsia="nl-NL"/>
         </w:rPr>
-        <w:t>0.59</w:t>
-      </w:r>
-      <w:r>
-        <w:rPr>
-          <w:rFonts w:ascii="Times New Roman" w:eastAsia="Times New Roman" w:hAnsi="Times New Roman" w:cs="Times New Roman"/>
-          <w:sz w:val="24"/>
-          <w:szCs w:val="24"/>
-          <w:lang w:eastAsia="nl-NL"/>
-        </w:rPr>
-        <w:t xml:space="preserve"> </w:t>
-      </w:r>
-    </w:p>
-    <w:p>
-      <w:pPr>
-        <w:spacing w:after="0" w:line="240" w:lineRule="auto"/>
-        <w:rPr>
-          <w:rFonts w:ascii="Times New Roman" w:eastAsia="Times New Roman" w:hAnsi="Times New Roman" w:cs="Times New Roman"/>
-          <w:sz w:val="24"/>
-          <w:szCs w:val="24"/>
-          <w:lang w:eastAsia="nl-NL"/>
-        </w:rPr>
-      </w:pPr>
-      <w:r>
-        <w:rPr>
-          <w:rFonts w:ascii="Times New Roman" w:eastAsia="Times New Roman" w:hAnsi="Symbol" w:cs="Times New Roman"/>
-          <w:sz w:val="24"/>
-          <w:szCs w:val="24"/>
-          <w:lang w:eastAsia="nl-NL"/>
-        </w:rPr>
         <w:t></w:t>
       </w:r>
       <w:r>
@@ -3474,69 +3423,9 @@
           <w:rFonts w:ascii="Times New Roman" w:eastAsia="Times New Roman" w:hAnsi="Times New Roman" w:cs="Times New Roman"/>
           <w:sz w:val="24"/>
           <w:szCs w:val="24"/>
-          <w:lang w:eastAsia="nl-NL"/>
-        </w:rPr>
-        <w:t xml:space="preserve">  LCC </w:t>
-      </w:r>
-      <w:proofErr w:type="spellStart"/>
-      <w:r>
-        <w:rPr>
-          <w:rFonts w:ascii="Times New Roman" w:eastAsia="Times New Roman" w:hAnsi="Times New Roman" w:cs="Times New Roman"/>
-          <w:sz w:val="24"/>
-          <w:szCs w:val="24"/>
-          <w:lang w:eastAsia="nl-NL"/>
-        </w:rPr>
-        <w:t>central</w:t>
-      </w:r>
-      <w:proofErr w:type="spellEnd"/>
-      <w:r>
-        <w:rPr>
-          <w:rFonts w:ascii="Times New Roman" w:eastAsia="Times New Roman" w:hAnsi="Times New Roman" w:cs="Times New Roman"/>
-          <w:sz w:val="24"/>
-          <w:szCs w:val="24"/>
-          <w:lang w:eastAsia="nl-NL"/>
-        </w:rPr>
-        <w:t xml:space="preserve"> </w:t>
-      </w:r>
-      <w:proofErr w:type="spellStart"/>
-      <w:r>
-        <w:rPr>
-          <w:rFonts w:ascii="Times New Roman" w:eastAsia="Times New Roman" w:hAnsi="Times New Roman" w:cs="Times New Roman"/>
-          <w:sz w:val="24"/>
-          <w:szCs w:val="24"/>
-          <w:lang w:eastAsia="nl-NL"/>
-        </w:rPr>
-        <w:t>vs</w:t>
-      </w:r>
-      <w:proofErr w:type="spellEnd"/>
-      <w:r>
-        <w:rPr>
-          <w:rFonts w:ascii="Times New Roman" w:eastAsia="Times New Roman" w:hAnsi="Times New Roman" w:cs="Times New Roman"/>
-          <w:sz w:val="24"/>
-          <w:szCs w:val="24"/>
-          <w:lang w:eastAsia="nl-NL"/>
-        </w:rPr>
-        <w:t xml:space="preserve"> </w:t>
-      </w:r>
-      <w:proofErr w:type="spellStart"/>
-      <w:r>
-        <w:rPr>
-          <w:rFonts w:ascii="Times New Roman" w:eastAsia="Times New Roman" w:hAnsi="Times New Roman" w:cs="Times New Roman"/>
-          <w:sz w:val="24"/>
-          <w:szCs w:val="24"/>
-          <w:lang w:eastAsia="nl-NL"/>
-        </w:rPr>
-        <w:t>peripheral</w:t>
-      </w:r>
-      <w:proofErr w:type="spellEnd"/>
-      <w:r>
-        <w:rPr>
-          <w:rFonts w:ascii="Times New Roman" w:eastAsia="Times New Roman" w:hAnsi="Times New Roman" w:cs="Times New Roman"/>
-          <w:sz w:val="24"/>
-          <w:szCs w:val="24"/>
-          <w:lang w:eastAsia="nl-NL"/>
-        </w:rPr>
-        <w:t xml:space="preserve">: </w:t>
+          <w:lang w:val="en-US" w:eastAsia="nl-NL"/>
+        </w:rPr>
+        <w:t xml:space="preserve">  LCC central vs peripheral: </w:t>
       </w:r>
       <w:r>
         <w:rPr>
@@ -3545,35 +3434,35 @@
           <w:bCs/>
           <w:sz w:val="24"/>
           <w:szCs w:val="24"/>
+          <w:lang w:val="en-US" w:eastAsia="nl-NL"/>
+        </w:rPr>
+        <w:t>0.42</w:t>
+      </w:r>
+      <w:r>
+        <w:rPr>
+          <w:rFonts w:ascii="Times New Roman" w:eastAsia="Times New Roman" w:hAnsi="Times New Roman" w:cs="Times New Roman"/>
+          <w:sz w:val="24"/>
+          <w:szCs w:val="24"/>
+          <w:lang w:val="en-US" w:eastAsia="nl-NL"/>
+        </w:rPr>
+        <w:t xml:space="preserve"> </w:t>
+      </w:r>
+    </w:p>
+    <w:p>
+      <w:pPr>
+        <w:rPr>
+          <w:sz w:val="28"/>
+          <w:szCs w:val="28"/>
+          <w:lang w:val="en-US"/>
+        </w:rPr>
+      </w:pPr>
+      <w:r>
+        <w:rPr>
+          <w:rFonts w:ascii="Times New Roman" w:eastAsia="Times New Roman" w:hAnsi="Symbol" w:cs="Times New Roman"/>
+          <w:sz w:val="24"/>
+          <w:szCs w:val="24"/>
           <w:lang w:eastAsia="nl-NL"/>
         </w:rPr>
-        <w:t>0.42</w:t>
-      </w:r>
-      <w:r>
-        <w:rPr>
-          <w:rFonts w:ascii="Times New Roman" w:eastAsia="Times New Roman" w:hAnsi="Times New Roman" w:cs="Times New Roman"/>
-          <w:sz w:val="24"/>
-          <w:szCs w:val="24"/>
-          <w:lang w:eastAsia="nl-NL"/>
-        </w:rPr>
-        <w:t xml:space="preserve"> </w:t>
-      </w:r>
-    </w:p>
-    <w:p>
-      <w:pPr>
-        <w:rPr>
-          <w:sz w:val="28"/>
-          <w:szCs w:val="28"/>
-          <w:lang w:val="en-US"/>
-        </w:rPr>
-      </w:pPr>
-      <w:r>
-        <w:rPr>
-          <w:rFonts w:ascii="Times New Roman" w:eastAsia="Times New Roman" w:hAnsi="Symbol" w:cs="Times New Roman"/>
-          <w:sz w:val="24"/>
-          <w:szCs w:val="24"/>
-          <w:lang w:eastAsia="nl-NL"/>
-        </w:rPr>
         <w:t></w:t>
       </w:r>
       <w:r>
@@ -3581,69 +3470,9 @@
           <w:rFonts w:ascii="Times New Roman" w:eastAsia="Times New Roman" w:hAnsi="Times New Roman" w:cs="Times New Roman"/>
           <w:sz w:val="24"/>
           <w:szCs w:val="24"/>
-          <w:lang w:eastAsia="nl-NL"/>
-        </w:rPr>
-        <w:t xml:space="preserve">  RCC </w:t>
-      </w:r>
-      <w:proofErr w:type="spellStart"/>
-      <w:r>
-        <w:rPr>
-          <w:rFonts w:ascii="Times New Roman" w:eastAsia="Times New Roman" w:hAnsi="Times New Roman" w:cs="Times New Roman"/>
-          <w:sz w:val="24"/>
-          <w:szCs w:val="24"/>
-          <w:lang w:eastAsia="nl-NL"/>
-        </w:rPr>
-        <w:t>central</w:t>
-      </w:r>
-      <w:proofErr w:type="spellEnd"/>
-      <w:r>
-        <w:rPr>
-          <w:rFonts w:ascii="Times New Roman" w:eastAsia="Times New Roman" w:hAnsi="Times New Roman" w:cs="Times New Roman"/>
-          <w:sz w:val="24"/>
-          <w:szCs w:val="24"/>
-          <w:lang w:eastAsia="nl-NL"/>
-        </w:rPr>
-        <w:t xml:space="preserve"> </w:t>
-      </w:r>
-      <w:proofErr w:type="spellStart"/>
-      <w:r>
-        <w:rPr>
-          <w:rFonts w:ascii="Times New Roman" w:eastAsia="Times New Roman" w:hAnsi="Times New Roman" w:cs="Times New Roman"/>
-          <w:sz w:val="24"/>
-          <w:szCs w:val="24"/>
-          <w:lang w:eastAsia="nl-NL"/>
-        </w:rPr>
-        <w:t>vs</w:t>
-      </w:r>
-      <w:proofErr w:type="spellEnd"/>
-      <w:r>
-        <w:rPr>
-          <w:rFonts w:ascii="Times New Roman" w:eastAsia="Times New Roman" w:hAnsi="Times New Roman" w:cs="Times New Roman"/>
-          <w:sz w:val="24"/>
-          <w:szCs w:val="24"/>
-          <w:lang w:eastAsia="nl-NL"/>
-        </w:rPr>
-        <w:t xml:space="preserve"> </w:t>
-      </w:r>
-      <w:proofErr w:type="spellStart"/>
-      <w:r>
-        <w:rPr>
-          <w:rFonts w:ascii="Times New Roman" w:eastAsia="Times New Roman" w:hAnsi="Times New Roman" w:cs="Times New Roman"/>
-          <w:sz w:val="24"/>
-          <w:szCs w:val="24"/>
-          <w:lang w:eastAsia="nl-NL"/>
-        </w:rPr>
-        <w:t>peripheral</w:t>
-      </w:r>
-      <w:proofErr w:type="spellEnd"/>
-      <w:r>
-        <w:rPr>
-          <w:rFonts w:ascii="Times New Roman" w:eastAsia="Times New Roman" w:hAnsi="Times New Roman" w:cs="Times New Roman"/>
-          <w:sz w:val="24"/>
-          <w:szCs w:val="24"/>
-          <w:lang w:eastAsia="nl-NL"/>
-        </w:rPr>
-        <w:t xml:space="preserve">: </w:t>
+          <w:lang w:val="en-US" w:eastAsia="nl-NL"/>
+        </w:rPr>
+        <w:t xml:space="preserve">  RCC central vs peripheral: </w:t>
       </w:r>
       <w:r>
         <w:rPr>
@@ -3652,7 +3481,7 @@
           <w:bCs/>
           <w:sz w:val="24"/>
           <w:szCs w:val="24"/>
-          <w:lang w:eastAsia="nl-NL"/>
+          <w:lang w:val="en-US" w:eastAsia="nl-NL"/>
         </w:rPr>
         <w:t>0.29</w:t>
       </w:r>
@@ -3842,6 +3671,7 @@
       </w:pPr>
       <w:r>
         <w:rPr>
+          <w:noProof/>
           <w:sz w:val="28"/>
           <w:szCs w:val="28"/>
           <w:lang w:val="en-US"/>
@@ -4055,6 +3885,7 @@
       </w:pPr>
       <w:r>
         <w:rPr>
+          <w:noProof/>
           <w:sz w:val="28"/>
           <w:szCs w:val="28"/>
           <w:lang w:val="en-US"/>

</xml_diff>